<commit_message>
DSA: work on stationary sonde weirness Annie discovered
</commit_message>
<xml_diff>
--- a/inst/troll_outline.docx
+++ b/inst/troll_outline.docx
@@ -101,6 +101,56 @@
       <w:r>
         <w:t>exist in data</w:t>
       </w:r>
+    </w:p>
+    <w:p>
+      <w:pPr>
+        <w:pStyle w:val="ListParagraph"/>
+        <w:numPr>
+          <w:ilvl w:val="0"/>
+          <w:numId w:val="1"/>
+        </w:numPr>
+      </w:pPr>
+      <w:proofErr w:type="spellStart"/>
+      <w:r>
+        <w:t>rename_trollcols</w:t>
+      </w:r>
+      <w:proofErr w:type="spellEnd"/>
+      <w:r>
+        <w:t>()</w:t>
+      </w:r>
+    </w:p>
+    <w:p>
+      <w:pPr>
+        <w:pStyle w:val="ListParagraph"/>
+        <w:numPr>
+          <w:ilvl w:val="1"/>
+          <w:numId w:val="1"/>
+        </w:numPr>
+      </w:pPr>
+      <w:r>
+        <w:t>Detects columns from the TROLL-Com</w:t>
+      </w:r>
+    </w:p>
+    <w:p>
+      <w:pPr>
+        <w:pStyle w:val="ListParagraph"/>
+        <w:numPr>
+          <w:ilvl w:val="2"/>
+          <w:numId w:val="1"/>
+        </w:numPr>
+      </w:pPr>
+      <w:r>
+        <w:t>Renames Com Temperature</w:t>
+      </w:r>
+    </w:p>
+    <w:p>
+      <w:pPr>
+        <w:pStyle w:val="ListParagraph"/>
+        <w:numPr>
+          <w:ilvl w:val="1"/>
+          <w:numId w:val="1"/>
+        </w:numPr>
+      </w:pPr>
       <w:bookmarkStart w:id="0" w:name="_GoBack"/>
       <w:bookmarkEnd w:id="0"/>
     </w:p>

</xml_diff>

<commit_message>
DSA: Clean up files for PR to main
</commit_message>
<xml_diff>
--- a/inst/troll_outline.docx
+++ b/inst/troll_outline.docx
@@ -12,7 +12,7 @@
       </w:pPr>
       <w:proofErr w:type="spellStart"/>
       <w:r>
-        <w:t>Read_datafile</w:t>
+        <w:t>TROLL_read_data</w:t>
       </w:r>
       <w:proofErr w:type="spellEnd"/>
       <w:r>
@@ -30,6 +30,9 @@
       <w:r>
         <w:t>Check file exists</w:t>
       </w:r>
+      <w:r>
+        <w:t xml:space="preserve"> at given path</w:t>
+      </w:r>
     </w:p>
     <w:p>
       <w:pPr>
@@ -101,6 +104,443 @@
       <w:r>
         <w:t>exist in data</w:t>
       </w:r>
+    </w:p>
+    <w:p>
+      <w:pPr>
+        <w:pStyle w:val="ListParagraph"/>
+        <w:numPr>
+          <w:ilvl w:val="0"/>
+          <w:numId w:val="1"/>
+        </w:numPr>
+      </w:pPr>
+      <w:proofErr w:type="spellStart"/>
+      <w:r>
+        <w:t>TROLL_rename_cols</w:t>
+      </w:r>
+      <w:proofErr w:type="spellEnd"/>
+      <w:r>
+        <w:t>()</w:t>
+      </w:r>
+    </w:p>
+    <w:p>
+      <w:pPr>
+        <w:pStyle w:val="ListParagraph"/>
+        <w:numPr>
+          <w:ilvl w:val="1"/>
+          <w:numId w:val="1"/>
+        </w:numPr>
+      </w:pPr>
+      <w:r>
+        <w:t>Detects presence of Troll-Com columns using serial #’s</w:t>
+      </w:r>
+    </w:p>
+    <w:p>
+      <w:pPr>
+        <w:pStyle w:val="ListParagraph"/>
+        <w:numPr>
+          <w:ilvl w:val="2"/>
+          <w:numId w:val="1"/>
+        </w:numPr>
+      </w:pPr>
+      <w:r>
+        <w:t>Removes Troll-Com temperature, if present</w:t>
+      </w:r>
+    </w:p>
+    <w:p>
+      <w:pPr>
+        <w:pStyle w:val="ListParagraph"/>
+        <w:numPr>
+          <w:ilvl w:val="1"/>
+          <w:numId w:val="1"/>
+        </w:numPr>
+      </w:pPr>
+      <w:r>
+        <w:t>Removes serials numbers inside parentheses</w:t>
+      </w:r>
+    </w:p>
+    <w:p>
+      <w:pPr>
+        <w:pStyle w:val="ListParagraph"/>
+        <w:numPr>
+          <w:ilvl w:val="1"/>
+          <w:numId w:val="1"/>
+        </w:numPr>
+      </w:pPr>
+      <w:r>
+        <w:t>Uses pattern matching of raw column names to the internal “</w:t>
+      </w:r>
+      <w:proofErr w:type="spellStart"/>
+      <w:r>
+        <w:t>troll_column_dictionary</w:t>
+      </w:r>
+      <w:proofErr w:type="spellEnd"/>
+      <w:r>
+        <w:t>” to rename c</w:t>
+      </w:r>
+      <w:r>
+        <w:t xml:space="preserve">olumns into standardized form. </w:t>
+      </w:r>
+    </w:p>
+    <w:p>
+      <w:pPr>
+        <w:pStyle w:val="ListParagraph"/>
+        <w:numPr>
+          <w:ilvl w:val="2"/>
+          <w:numId w:val="1"/>
+        </w:numPr>
+      </w:pPr>
+      <w:r>
+        <w:t>If an unknown column is present, will error and tell you to update the dictionary</w:t>
+      </w:r>
+    </w:p>
+    <w:p>
+      <w:pPr>
+        <w:pStyle w:val="ListParagraph"/>
+        <w:numPr>
+          <w:ilvl w:val="3"/>
+          <w:numId w:val="1"/>
+        </w:numPr>
+      </w:pPr>
+      <w:r>
+        <w:t>Current workaround w/o updating dictionary would be to remove that column manually before processing</w:t>
+      </w:r>
+    </w:p>
+    <w:p>
+      <w:pPr>
+        <w:pStyle w:val="ListParagraph"/>
+        <w:numPr>
+          <w:ilvl w:val="2"/>
+          <w:numId w:val="1"/>
+        </w:numPr>
+      </w:pPr>
+      <w:r>
+        <w:t>If pattern matching results in two column names, it will error</w:t>
+      </w:r>
+    </w:p>
+    <w:p>
+      <w:pPr>
+        <w:pStyle w:val="ListParagraph"/>
+        <w:numPr>
+          <w:ilvl w:val="0"/>
+          <w:numId w:val="1"/>
+        </w:numPr>
+      </w:pPr>
+      <w:proofErr w:type="spellStart"/>
+      <w:r>
+        <w:t>Is_stationary</w:t>
+      </w:r>
+      <w:proofErr w:type="spellEnd"/>
+      <w:r>
+        <w:t>()</w:t>
+      </w:r>
+    </w:p>
+    <w:p>
+      <w:pPr>
+        <w:pStyle w:val="ListParagraph"/>
+        <w:numPr>
+          <w:ilvl w:val="1"/>
+          <w:numId w:val="1"/>
+        </w:numPr>
+      </w:pPr>
+      <w:r>
+        <w:t>Automatically computes sample interval (internal utility function), and warns if time jumps exist in data</w:t>
+      </w:r>
+    </w:p>
+    <w:p>
+      <w:pPr>
+        <w:pStyle w:val="ListParagraph"/>
+        <w:numPr>
+          <w:ilvl w:val="2"/>
+          <w:numId w:val="1"/>
+        </w:numPr>
+      </w:pPr>
+      <w:r>
+        <w:t>If sampling interval is &gt; 30s, sensor assumed fixed in position and all “</w:t>
+      </w:r>
+      <w:proofErr w:type="spellStart"/>
+      <w:r>
+        <w:t>is_stationary_status</w:t>
+      </w:r>
+      <w:proofErr w:type="spellEnd"/>
+      <w:r>
+        <w:t>” returned as 999</w:t>
+      </w:r>
+    </w:p>
+    <w:p>
+      <w:pPr>
+        <w:pStyle w:val="ListParagraph"/>
+        <w:numPr>
+          <w:ilvl w:val="1"/>
+          <w:numId w:val="1"/>
+        </w:numPr>
+      </w:pPr>
+      <w:r>
+        <w:t>Detects stationary periods in data using raw depth</w:t>
+      </w:r>
+    </w:p>
+    <w:p>
+      <w:pPr>
+        <w:pStyle w:val="ListParagraph"/>
+        <w:numPr>
+          <w:ilvl w:val="2"/>
+          <w:numId w:val="1"/>
+        </w:numPr>
+      </w:pPr>
+      <w:r>
+        <w:t>A stationary block is flagged when the data in “</w:t>
+      </w:r>
+      <w:proofErr w:type="spellStart"/>
+      <w:r>
+        <w:t>depth_col</w:t>
+      </w:r>
+      <w:proofErr w:type="spellEnd"/>
+      <w:r>
+        <w:t>” remains less than the user supplied “</w:t>
+      </w:r>
+      <w:proofErr w:type="spellStart"/>
+      <w:r>
+        <w:t>depth_range_threshold</w:t>
+      </w:r>
+      <w:proofErr w:type="spellEnd"/>
+      <w:r>
+        <w:t xml:space="preserve">” </w:t>
+      </w:r>
+      <w:r>
+        <w:t xml:space="preserve">across a </w:t>
+      </w:r>
+      <w:r>
+        <w:t xml:space="preserve">rolling range </w:t>
+      </w:r>
+      <w:r>
+        <w:t>window</w:t>
+      </w:r>
+    </w:p>
+    <w:p>
+      <w:pPr>
+        <w:pStyle w:val="ListParagraph"/>
+        <w:numPr>
+          <w:ilvl w:val="2"/>
+          <w:numId w:val="1"/>
+        </w:numPr>
+      </w:pPr>
+      <w:r>
+        <w:t>User input  “</w:t>
+      </w:r>
+      <w:proofErr w:type="spellStart"/>
+      <w:r>
+        <w:t>rolling_range_secs</w:t>
+      </w:r>
+      <w:proofErr w:type="spellEnd"/>
+      <w:r>
+        <w:t>” sets the window width for rolling range calculation for detecting stationary periods</w:t>
+      </w:r>
+    </w:p>
+    <w:p>
+      <w:pPr>
+        <w:pStyle w:val="ListParagraph"/>
+        <w:numPr>
+          <w:ilvl w:val="1"/>
+          <w:numId w:val="1"/>
+        </w:numPr>
+      </w:pPr>
+      <w:r>
+        <w:t>Optionally trims the front end of stationary periods</w:t>
+      </w:r>
+    </w:p>
+    <w:p>
+      <w:pPr>
+        <w:pStyle w:val="ListParagraph"/>
+        <w:numPr>
+          <w:ilvl w:val="2"/>
+          <w:numId w:val="1"/>
+        </w:numPr>
+      </w:pPr>
+      <w:r>
+        <w:t>User input “</w:t>
+      </w:r>
+      <w:proofErr w:type="spellStart"/>
+      <w:r>
+        <w:t>start_trim_secs</w:t>
+      </w:r>
+      <w:proofErr w:type="spellEnd"/>
+      <w:r>
+        <w:t>” allows the user to determine the length of time to trim off the start of a stationary period</w:t>
+      </w:r>
+    </w:p>
+    <w:p>
+      <w:pPr>
+        <w:pStyle w:val="ListParagraph"/>
+        <w:numPr>
+          <w:ilvl w:val="3"/>
+          <w:numId w:val="1"/>
+        </w:numPr>
+      </w:pPr>
+      <w:r>
+        <w:t>By default, a minimum of one observation is flagged unstable at the start of each stationary period</w:t>
+      </w:r>
+    </w:p>
+    <w:p>
+      <w:pPr>
+        <w:pStyle w:val="ListParagraph"/>
+        <w:numPr>
+          <w:ilvl w:val="1"/>
+          <w:numId w:val="1"/>
+        </w:numPr>
+      </w:pPr>
+      <w:r>
+        <w:t xml:space="preserve">Flag stationary periods </w:t>
+      </w:r>
+    </w:p>
+    <w:p>
+      <w:pPr>
+        <w:pStyle w:val="ListParagraph"/>
+        <w:numPr>
+          <w:ilvl w:val="2"/>
+          <w:numId w:val="1"/>
+        </w:numPr>
+      </w:pPr>
+      <w:r>
+        <w:t>Appends column “</w:t>
+      </w:r>
+      <w:proofErr w:type="spellStart"/>
+      <w:r>
+        <w:t>is_stationary_status</w:t>
+      </w:r>
+      <w:proofErr w:type="spellEnd"/>
+      <w:r>
+        <w:t xml:space="preserve">” to input </w:t>
+      </w:r>
+      <w:proofErr w:type="spellStart"/>
+      <w:r>
+        <w:t>dataframe</w:t>
+      </w:r>
+      <w:proofErr w:type="spellEnd"/>
+    </w:p>
+    <w:p>
+      <w:pPr>
+        <w:pStyle w:val="ListParagraph"/>
+        <w:numPr>
+          <w:ilvl w:val="2"/>
+          <w:numId w:val="1"/>
+        </w:numPr>
+      </w:pPr>
+      <w:r>
+        <w:t>Stationary periods lasting longer than “</w:t>
+      </w:r>
+      <w:proofErr w:type="spellStart"/>
+      <w:r>
+        <w:t>stationary_secs</w:t>
+      </w:r>
+      <w:proofErr w:type="spellEnd"/>
+      <w:r>
+        <w:t>” are flagged as 999</w:t>
+      </w:r>
+    </w:p>
+    <w:p>
+      <w:pPr>
+        <w:pStyle w:val="ListParagraph"/>
+        <w:numPr>
+          <w:ilvl w:val="2"/>
+          <w:numId w:val="1"/>
+        </w:numPr>
+      </w:pPr>
+      <w:r>
+        <w:t>Stationary periods &gt; 0 but &lt; “</w:t>
+      </w:r>
+      <w:proofErr w:type="spellStart"/>
+      <w:r>
+        <w:t>stationary_secs</w:t>
+      </w:r>
+      <w:proofErr w:type="spellEnd"/>
+      <w:r>
+        <w:t>” are flagged with their stationary duration in seconds</w:t>
+      </w:r>
+    </w:p>
+    <w:p>
+      <w:pPr>
+        <w:pStyle w:val="ListParagraph"/>
+        <w:numPr>
+          <w:ilvl w:val="2"/>
+          <w:numId w:val="1"/>
+        </w:numPr>
+      </w:pPr>
+      <w:r>
+        <w:t>non-stationary periods are flagged as 0</w:t>
+      </w:r>
+    </w:p>
+    <w:p>
+      <w:pPr>
+        <w:pStyle w:val="ListParagraph"/>
+        <w:numPr>
+          <w:ilvl w:val="1"/>
+          <w:numId w:val="1"/>
+        </w:numPr>
+      </w:pPr>
+      <w:r>
+        <w:t>Returns actual depth of stationary period</w:t>
+      </w:r>
+    </w:p>
+    <w:p>
+      <w:pPr>
+        <w:pStyle w:val="ListParagraph"/>
+        <w:numPr>
+          <w:ilvl w:val="2"/>
+          <w:numId w:val="1"/>
+        </w:numPr>
+      </w:pPr>
+      <w:r>
+        <w:t>Appends column “</w:t>
+      </w:r>
+      <w:proofErr w:type="spellStart"/>
+      <w:r>
+        <w:t>stationary_depth</w:t>
+      </w:r>
+      <w:proofErr w:type="spellEnd"/>
+      <w:r>
+        <w:t xml:space="preserve">” to input </w:t>
+      </w:r>
+      <w:proofErr w:type="spellStart"/>
+      <w:r>
+        <w:t>dataframe</w:t>
+      </w:r>
+      <w:proofErr w:type="spellEnd"/>
+      <w:r>
+        <w:t xml:space="preserve"> equal to the mean depth across the stationary period</w:t>
+      </w:r>
+    </w:p>
+    <w:p>
+      <w:pPr>
+        <w:pStyle w:val="ListParagraph"/>
+        <w:numPr>
+          <w:ilvl w:val="1"/>
+          <w:numId w:val="1"/>
+        </w:numPr>
+      </w:pPr>
+      <w:r>
+        <w:t>Optionally plots stationary periods and rolling range</w:t>
+      </w:r>
+    </w:p>
+    <w:p>
+      <w:pPr>
+        <w:pStyle w:val="ListParagraph"/>
+        <w:numPr>
+          <w:ilvl w:val="2"/>
+          <w:numId w:val="1"/>
+        </w:numPr>
+      </w:pPr>
+      <w:r>
+        <w:lastRenderedPageBreak/>
+        <w:t>Nice for tuning inputs, a stacked plot showing stationary periods color coded by duration</w:t>
+      </w:r>
+    </w:p>
+    <w:p>
+      <w:pPr>
+        <w:pStyle w:val="ListParagraph"/>
+        <w:numPr>
+          <w:ilvl w:val="0"/>
+          <w:numId w:val="1"/>
+        </w:numPr>
+      </w:pPr>
       <w:bookmarkStart w:id="0" w:name="_GoBack"/>
       <w:bookmarkEnd w:id="0"/>
     </w:p>
@@ -150,7 +590,7 @@
         <w:ind w:left="2160" w:hanging="180"/>
       </w:pPr>
     </w:lvl>
-    <w:lvl w:ilvl="3" w:tplc="0409000F" w:tentative="1">
+    <w:lvl w:ilvl="3" w:tplc="0409000F">
       <w:start w:val="1"/>
       <w:numFmt w:val="decimal"/>
       <w:lvlText w:val="%4."/>

</xml_diff>